<commit_message>
Untrack Marabou checkout, course materials, and Office lock files
Marabou was tracked as a gitlink with no .gitmodules, pointing at a commit
that exists only in the local clone. Removed from the index and ignored,
so a clone no longer carries an unresolvable reference.

Course slides and the Week 5 lecture PDF moved to the ignored
lab-submissions/ directory. Post-mortem template and draft dropped.
Word lock files (~$*) removed and ignored.

Also updates the Week 9 verification report PDF and DOCX.

Co-Authored-By: Claude Opus 5 (1M context) <noreply@anthropic.com>
Claude-Session: https://claude.ai/code/session_017Ro2XXMG59Xy6BH53bm94k
</commit_message>
<xml_diff>
--- a/formal-verification/W9_Verification_Report_Singapore_HDB_Monotonicity.docx
+++ b/formal-verification/W9_Verification_Report_Singapore_HDB_Monotonicity.docx
@@ -63,16 +63,7 @@
         <w:jc w:val="center"/>
       </w:pPr>
       <w:r>
-        <w:t>Team</w:t>
-      </w:r>
-      <w:r>
-        <w:t xml:space="preserve">: </w:t>
-      </w:r>
-      <w:r>
-        <w:t xml:space="preserve">Charles Foo, Sagar Pratap Singh </w:t>
-      </w:r>
-      <w:r>
-        <w:t>| Course: Trustworthy AI | Date: 2026-07-18</w:t>
+        <w:t>Team: Charles Foo, Sagar Pratap Singh | Course: Trustworthy AI | Date: 2026-07-18</w:t>
       </w:r>
     </w:p>
     <w:p>
@@ -160,21 +151,7 @@
           <w:bCs/>
           <w:sz w:val="22"/>
         </w:rPr>
-        <w:t xml:space="preserve"> pricing models where there </w:t>
-      </w:r>
-      <w:r>
-        <w:rPr>
-          <w:bCs/>
-          <w:sz w:val="22"/>
-        </w:rPr>
-        <w:t>is an expected correlation between an input feature (floor area) and price movement</w:t>
-      </w:r>
-      <w:r>
-        <w:rPr>
-          <w:bCs/>
-          <w:sz w:val="22"/>
-        </w:rPr>
-        <w:t>, specifically, l</w:t>
+        <w:t xml:space="preserve"> pricing models where there is an expected correlation between an input feature (floor area) and price movement, specifically, l</w:t>
       </w:r>
       <w:r>
         <w:rPr>
@@ -432,6 +409,7 @@
       <w:r>
         <w:rPr>
           <w:bCs/>
+          <w:noProof/>
           <w:sz w:val="22"/>
         </w:rPr>
         <w:drawing>
@@ -496,6 +474,7 @@
       <w:r>
         <w:rPr>
           <w:bCs/>
+          <w:noProof/>
           <w:sz w:val="22"/>
         </w:rPr>
         <w:lastRenderedPageBreak/>
@@ -551,6 +530,7 @@
       <w:r>
         <w:rPr>
           <w:bCs/>
+          <w:noProof/>
           <w:sz w:val="22"/>
         </w:rPr>
         <w:drawing>
@@ -710,7 +690,77 @@
           <w:bCs/>
           <w:sz w:val="22"/>
         </w:rPr>
-        <w:t>e split the data into train and test sets before scaling the features and training the model</w:t>
+        <w:t xml:space="preserve">e </w:t>
+      </w:r>
+      <w:r>
+        <w:rPr>
+          <w:bCs/>
+          <w:sz w:val="22"/>
+        </w:rPr>
+        <w:t xml:space="preserve">created a stratified subset of 30k transactions from the HDB dataset and </w:t>
+      </w:r>
+      <w:r>
+        <w:rPr>
+          <w:bCs/>
+          <w:sz w:val="22"/>
+        </w:rPr>
+        <w:t xml:space="preserve">split </w:t>
+      </w:r>
+      <w:r>
+        <w:rPr>
+          <w:bCs/>
+          <w:sz w:val="22"/>
+        </w:rPr>
+        <w:t xml:space="preserve">24k </w:t>
+      </w:r>
+      <w:r>
+        <w:rPr>
+          <w:bCs/>
+          <w:sz w:val="22"/>
+        </w:rPr>
+        <w:t xml:space="preserve">into train </w:t>
+      </w:r>
+      <w:r>
+        <w:rPr>
+          <w:bCs/>
+          <w:sz w:val="22"/>
+        </w:rPr>
+        <w:t xml:space="preserve">(80%) </w:t>
+      </w:r>
+      <w:r>
+        <w:rPr>
+          <w:bCs/>
+          <w:sz w:val="22"/>
+        </w:rPr>
+        <w:t xml:space="preserve">and </w:t>
+      </w:r>
+      <w:r>
+        <w:rPr>
+          <w:bCs/>
+          <w:sz w:val="22"/>
+        </w:rPr>
+        <w:t xml:space="preserve">6k </w:t>
+      </w:r>
+      <w:r>
+        <w:rPr>
+          <w:bCs/>
+          <w:sz w:val="22"/>
+        </w:rPr>
+        <w:t xml:space="preserve">test sets </w:t>
+      </w:r>
+      <w:r>
+        <w:rPr>
+          <w:bCs/>
+          <w:sz w:val="22"/>
+        </w:rPr>
+        <w:t xml:space="preserve">(20%) </w:t>
+      </w:r>
+      <w:r>
+        <w:rPr>
+          <w:bCs/>
+          <w:sz w:val="22"/>
+        </w:rPr>
+        <w:t>before scaling the features and training the model</w:t>
       </w:r>
       <w:r>
         <w:rPr>
@@ -866,6 +916,7 @@
             <w:r>
               <w:rPr>
                 <w:bCs/>
+                <w:noProof/>
                 <w:sz w:val="22"/>
               </w:rPr>
               <w:drawing>
@@ -920,6 +971,7 @@
             <w:r>
               <w:rPr>
                 <w:bCs/>
+                <w:noProof/>
                 <w:sz w:val="22"/>
               </w:rPr>
               <w:drawing>
@@ -1003,6 +1055,7 @@
             <w:r>
               <w:rPr>
                 <w:bCs/>
+                <w:noProof/>
                 <w:sz w:val="22"/>
               </w:rPr>
               <w:lastRenderedPageBreak/>
@@ -1058,6 +1111,7 @@
             <w:r>
               <w:rPr>
                 <w:bCs/>
+                <w:noProof/>
                 <w:sz w:val="22"/>
               </w:rPr>
               <w:drawing>
@@ -1484,6 +1538,7 @@
       <w:r>
         <w:rPr>
           <w:bCs/>
+          <w:noProof/>
           <w:sz w:val="22"/>
         </w:rPr>
         <w:lastRenderedPageBreak/>
@@ -1534,6 +1589,7 @@
       <w:r>
         <w:rPr>
           <w:bCs/>
+          <w:noProof/>
           <w:sz w:val="22"/>
         </w:rPr>
         <w:drawing>
@@ -1743,6 +1799,66 @@
                 <w:bCs/>
               </w:rPr>
               <w:t>time (s)</w:t>
+            </w:r>
+          </w:p>
+        </w:tc>
+      </w:tr>
+      <w:tr>
+        <w:tc>
+          <w:tcPr>
+            <w:tcW w:w="1728" w:type="dxa"/>
+          </w:tcPr>
+          <w:p>
+            <w:r>
+              <w:t>ANG MO KIO</w:t>
+            </w:r>
+          </w:p>
+        </w:tc>
+        <w:tc>
+          <w:tcPr>
+            <w:tcW w:w="1728" w:type="dxa"/>
+          </w:tcPr>
+          <w:p>
+            <w:r>
+              <w:t>3 ROOM</w:t>
+            </w:r>
+          </w:p>
+        </w:tc>
+        <w:tc>
+          <w:tcPr>
+            <w:tcW w:w="1728" w:type="dxa"/>
+          </w:tcPr>
+          <w:p>
+            <w:r>
+              <w:t>82.0</w:t>
+            </w:r>
+          </w:p>
+        </w:tc>
+        <w:tc>
+          <w:tcPr>
+            <w:tcW w:w="1728" w:type="dxa"/>
+          </w:tcPr>
+          <w:p>
+            <w:pPr>
+              <w:rPr>
+                <w:color w:val="00B050"/>
+              </w:rPr>
+            </w:pPr>
+            <w:r>
+              <w:rPr>
+                <w:color w:val="00B050"/>
+              </w:rPr>
+              <w:t>UNSAT</w:t>
+            </w:r>
+          </w:p>
+        </w:tc>
+        <w:tc>
+          <w:tcPr>
+            <w:tcW w:w="1728" w:type="dxa"/>
+          </w:tcPr>
+          <w:p>
+            <w:r>
+              <w:t>0.077</w:t>
             </w:r>
           </w:p>
         </w:tc>
@@ -1991,13 +2107,27 @@
     <w:p>
       <w:r>
         <w:br/>
-      </w:r>
-      <w:r>
-        <w:t>All four representative houses returned UNSAT for the negated monotonicity query: ANG MO KIO 3 ROOM, PUNGGOL 5 ROOM, TAMPINES 3 ROOM, and WOODLANDS 4 ROOM.</w:t>
+        <w:t xml:space="preserve">All </w:t>
+      </w:r>
+      <w:r>
+        <w:t>give</w:t>
+      </w:r>
+      <w:r>
+        <w:t xml:space="preserve"> representative houses returned UNSAT for the negated monotonicity query: ANG MO KIO 3 ROOM</w:t>
+      </w:r>
+      <w:r>
+        <w:t xml:space="preserve"> x2</w:t>
+      </w:r>
+      <w:r>
+        <w:t>, PUNGGOL 5 ROOM, TAMPINES 3 ROOM, and WOODLANDS 4 ROOM.</w:t>
       </w:r>
     </w:p>
     <w:p>
       <w:r>
+        <w:rPr>
+          <w:noProof/>
+        </w:rPr>
+        <w:lastRenderedPageBreak/>
         <w:drawing>
           <wp:inline distT="0" distB="0" distL="0" distR="0" wp14:anchorId="3101492D" wp14:editId="19612296">
             <wp:extent cx="5016500" cy="2794000"/>
@@ -2037,17 +2167,7 @@
     </w:p>
     <w:p>
       <w:r>
-        <w:lastRenderedPageBreak/>
-        <w:t xml:space="preserve">The above chart shows how the </w:t>
-      </w:r>
-      <w:r>
-        <w:t>predicted price changes as floor area increases from 0 to 0.1 sqm for one fixed HDB house</w:t>
-      </w:r>
-      <w:r>
-        <w:t xml:space="preserve">. </w:t>
-      </w:r>
-      <w:r>
-        <w:t>The yellow band is the certified region, and the blue curve staying at or above zero means the model is monotone there.</w:t>
+        <w:t>The above chart shows how the predicted price changes as floor area increases from 0 to 0.1 sqm for one fixed HDB house. The yellow band is the certified region, and the blue curve staying at or above zero means the model is monotone there.</w:t>
       </w:r>
     </w:p>
     <w:p/>
@@ -2121,32 +2241,35 @@
           <w:bCs/>
           <w:sz w:val="22"/>
         </w:rPr>
-        <w:t xml:space="preserve">In other words, within a 0.1 sqm increase in floor area and with all other features fixed, the model does not reduce its predicted price for these four representative HDB </w:t>
-      </w:r>
-      <w:proofErr w:type="spellStart"/>
-      <w:proofErr w:type="gramStart"/>
-      <w:r>
-        <w:rPr>
-          <w:bCs/>
-          <w:sz w:val="22"/>
-        </w:rPr>
-        <w:t>transactions.</w:t>
-      </w:r>
-      <w:r>
-        <w:rPr>
-          <w:bCs/>
-          <w:sz w:val="22"/>
-        </w:rPr>
-        <w:t>This</w:t>
-      </w:r>
-      <w:proofErr w:type="spellEnd"/>
-      <w:proofErr w:type="gramEnd"/>
-      <w:r>
-        <w:rPr>
-          <w:bCs/>
-          <w:sz w:val="22"/>
-        </w:rPr>
-        <w:t xml:space="preserve"> is stronger than an empirical spot-check because </w:t>
+        <w:t xml:space="preserve">In other words, within a 0.1 sqm increase in floor area and with all other features fixed, the model does not reduce its predicted price for these </w:t>
+      </w:r>
+      <w:r>
+        <w:rPr>
+          <w:bCs/>
+          <w:sz w:val="22"/>
+        </w:rPr>
+        <w:t>five</w:t>
+      </w:r>
+      <w:r>
+        <w:rPr>
+          <w:bCs/>
+          <w:sz w:val="22"/>
+        </w:rPr>
+        <w:t xml:space="preserve"> representative HDB transactions.</w:t>
+      </w:r>
+      <w:r>
+        <w:rPr>
+          <w:bCs/>
+          <w:sz w:val="22"/>
+        </w:rPr>
+        <w:t xml:space="preserve"> </w:t>
+      </w:r>
+      <w:r>
+        <w:rPr>
+          <w:bCs/>
+          <w:sz w:val="22"/>
+        </w:rPr>
+        <w:t xml:space="preserve">This is stronger than an empirical spot-check because </w:t>
       </w:r>
       <w:proofErr w:type="spellStart"/>
       <w:r>
@@ -2177,7 +2300,21 @@
           <w:bCs/>
           <w:sz w:val="22"/>
         </w:rPr>
-        <w:t>We should also caveat that this formal verification guarantee is pointwise and not global, since it is based on selected house sales from the dataset, not all 23k transactions. The result is still useful because it shows that the model obeys the intended monotonic relationship on multiple Singapore housing examples across different towns and flat types.</w:t>
+        <w:t xml:space="preserve">We should also caveat that this formal verification guarantee is pointwise and not global, since it is based on selected house sales from the </w:t>
+      </w:r>
+      <w:r>
+        <w:rPr>
+          <w:bCs/>
+          <w:sz w:val="22"/>
+        </w:rPr>
+        <w:t xml:space="preserve">training </w:t>
+      </w:r>
+      <w:r>
+        <w:rPr>
+          <w:bCs/>
+          <w:sz w:val="22"/>
+        </w:rPr>
+        <w:t>dataset, not all transactions. The result is still useful because it shows that the model obeys the intended monotonic relationship on multiple Singapore housing examples across different towns and flat types.</w:t>
       </w:r>
     </w:p>
     <w:p>
@@ -2251,7 +2388,15 @@
           <w:bCs/>
           <w:sz w:val="22"/>
         </w:rPr>
-        <w:t>narrow, covering only a tiny positive change in floor area while keeping other features fixed. For the purposes of this lab this demonstrates the local safety guarantee but will require more rigorous and sophisticated verification methods to hold in the actual Singapore HDB market.</w:t>
+        <w:t xml:space="preserve">narrow, covering only a tiny positive change in floor area while keeping other features fixed. For the purposes of this lab this demonstrates the local safety guarantee but will </w:t>
+      </w:r>
+      <w:r>
+        <w:rPr>
+          <w:bCs/>
+          <w:sz w:val="22"/>
+        </w:rPr>
+        <w:lastRenderedPageBreak/>
+        <w:t>require more rigorous and sophisticated verification methods to hold in the actual Singapore HDB market.</w:t>
       </w:r>
     </w:p>
     <w:p>

</xml_diff>